<commit_message>
created all entities, valueObjects, and enums
</commit_message>
<xml_diff>
--- a/Migration/GymTraker V2/GymTracker/docs/GymTracker-V2-Documentacion.docx
+++ b/Migration/GymTraker V2/GymTracker/docs/GymTracker-V2-Documentacion.docx
@@ -5080,6 +5080,165 @@
       </w:pPr>
       <w:r>
         <w:t>Login: Google → Identity → API filtra por UserId</w:t>
+      </w:r>
+    </w:p>
+    <w:p>
+      <w:pPr>
+        <w:pStyle w:val="Heading1"/>
+      </w:pPr>
+      <w:r>
+        <w:t>8. Decisiones de implementación — Fase 1 (Domain)</w:t>
+      </w:r>
+    </w:p>
+    <w:p>
+      <w:r>
+        <w:rPr>
+          <w:i/>
+        </w:rPr>
+        <w:t>Agregado el 2026-08-03. Complementan los ADR-001..009 de la sección 5.11 y reflejan el código real de GymTracker.Domain (compila con 0 warnings; 42/42 tests OK).</w:t>
+      </w:r>
+    </w:p>
+    <w:p>
+      <w:pPr>
+        <w:pStyle w:val="Heading2"/>
+      </w:pPr>
+      <w:r>
+        <w:t>ADR-010 — Value Objects en las entidades</w:t>
+      </w:r>
+    </w:p>
+    <w:p>
+      <w:r>
+        <w:t>Las entidades reciben Name, Repetitions y Weight (Value Objects) en sus constructores y métodos de dominio; nunca un string/int/decimal crudo donde ya existe la abstracción. Motivo: las reglas del concepto (nombre no vacío y recortado, reps ≥ 0, peso ≥ 0) viven en un solo lugar y es imposible crear estado inválido desde fuera. Costo: en Fase 2 se mapean con value converters de EF Core; las columnas de BD siguen siendo primitivas (string/int/decimal), por lo que el diccionario de la sección 5.4 no cambia.</w:t>
+      </w:r>
+    </w:p>
+    <w:p>
+      <w:pPr>
+        <w:pStyle w:val="Heading2"/>
+      </w:pPr>
+      <w:r>
+        <w:t>ADR-011 — Clave surrogada en ExerciseNote y UserExercisePreference</w:t>
+      </w:r>
+    </w:p>
+    <w:p>
+      <w:r>
+        <w:t>Se usa Guid Id (base Entity) + índice único (UserId, ExerciseName) en lugar de la PK compuesta del diccionario 5.4. Motivo: todas las entidades quedan homogéneas con la base Entity y la integridad se garantiza igual con el índice único. Alternativa: PK compuesta con Fluent API en Fase 2 si se prefiere fidelidad literal al diccionario.</w:t>
+      </w:r>
+    </w:p>
+    <w:p>
+      <w:pPr>
+        <w:pStyle w:val="Heading2"/>
+      </w:pPr>
+      <w:r>
+        <w:t>ADR-012 — DisplayOrder en WorkoutExercise</w:t>
+      </w:r>
+    </w:p>
+    <w:p>
+      <w:r>
+        <w:t>El diccionario 5.4 no lo contempla; se agregó. Motivo: el historial de index.html muestra los ejercicios en orden; sin esta columna se perdía funcionalidad al migrar. Las demás entidades ya tenían DisplayOrder.</w:t>
+      </w:r>
+    </w:p>
+    <w:p>
+      <w:pPr>
+        <w:pStyle w:val="Heading2"/>
+      </w:pPr>
+      <w:r>
+        <w:t>ADR-013 — Orden canónico = orden de lista</w:t>
+      </w:r>
+    </w:p>
+    <w:p>
+      <w:r>
+        <w:t>Invariante lista[i].DisplayOrder == i (y lista[i].SetNumber == i + 1 para series): el renumber recorre la lista en su orden y nunca reordena por DisplayOrder. Motivo: una sola fuente de verdad evita divergencias lista/orden; los tests detectaron el bug en la primera versión que ordenaba por DisplayOrder.</w:t>
+      </w:r>
+    </w:p>
+    <w:p>
+      <w:pPr>
+        <w:pStyle w:val="Heading2"/>
+      </w:pPr>
+      <w:r>
+        <w:t>ADR-014 — DomainException vs ArgumentException</w:t>
+      </w:r>
+    </w:p>
+    <w:p>
+      <w:r>
+        <w:t>Reglas de negocio lanzan DomainException (GymTracker.Domain.Exceptions); validación de argumentos lanza ArgumentException/ArgumentNullException/ArgumentOutOfRangeException estándar. Motivo: distingue estado inválido de uso incorrecto de la API; en Fase 4 el middleware podrá mapear DomainException a 409/422 y los argumentos a 400.</w:t>
+      </w:r>
+    </w:p>
+    <w:p>
+      <w:pPr>
+        <w:pStyle w:val="Heading2"/>
+      </w:pPr>
+      <w:r>
+        <w:t>ADR-015 — Enums alineados a la app</w:t>
+      </w:r>
+    </w:p>
+    <w:p>
+      <w:r>
+        <w:t>ExerciseType = Standard/Bodyweight/Weighted/Time (index.html: standard, bw, weighted, time); PrStatus = New/Matched + null (sin PR); Laterality = Bilateral/Unilateral; Theme = Light/Dark. Motivo: el modelo refleja el dominio real del producto, no un catálogo genérico de curso.</w:t>
+      </w:r>
+    </w:p>
+    <w:p>
+      <w:pPr>
+        <w:pStyle w:val="Heading2"/>
+      </w:pPr>
+      <w:r>
+        <w:t>ADR-016 — Timer validado</w:t>
+      </w:r>
+    </w:p>
+    <w:p>
+      <w:r>
+        <w:t>UserSettings: prep ≥ 0, work ≥ 1, rest ≥ 1, sets ≥ 1; defaults 10/40/20/5 tomados de index.html. Motivo: un intervalo de trabajo o descanso de 0 s no tiene sentido y los defaults preservan el comportamiento actual de la app.</w:t>
+      </w:r>
+    </w:p>
+    <w:p>
+      <w:pPr>
+        <w:pStyle w:val="Heading2"/>
+      </w:pPr>
+      <w:r>
+        <w:t>ADR-017 — Longitud máxima de nombres por entidad</w:t>
+      </w:r>
+    </w:p>
+    <w:p>
+      <w:r>
+        <w:t>La regla de longitud es por agregado (Routine/WorkoutSession = 100; SessionExercise/WorkoutExercise/ExerciseCatalogEntry = 150) y se valida en la entidad; el VO Name garantiza no vacío + trim. Motivo: la longitud es una regla específica de cada agregado; el no-vacío es una regla del concepto.</w:t>
+      </w:r>
+    </w:p>
+    <w:p>
+      <w:pPr>
+        <w:pStyle w:val="Heading2"/>
+      </w:pPr>
+      <w:r>
+        <w:t>ADR-018 — API de entidades con Value Objects</w:t>
+      </w:r>
+    </w:p>
+    <w:p>
+      <w:r>
+        <w:t>Los métodos públicos reciben VOs (Rename(Name), AddSet(Repetitions, Weight)); los métodos internal de wiring (Renumber(int), SetXxxId(Guid)) siguen primitivos. Motivo: el límite del dominio exige abstracciones; el wiring de EF es mecanismo interno, no dominio.</w:t>
+      </w:r>
+    </w:p>
+    <w:p>
+      <w:pPr>
+        <w:pStyle w:val="Heading2"/>
+      </w:pPr>
+      <w:r>
+        <w:t>ADR-019 — Sin GlobalUsings</w:t>
+      </w:r>
+    </w:p>
+    <w:p>
+      <w:r>
+        <w:t>Cada archivo declara sus usings explícitamente. Motivo: claridad para aprendizaje; un GlobalUsings ocultaría la procedencia de los tipos.</w:t>
+      </w:r>
+    </w:p>
+    <w:p>
+      <w:pPr>
+        <w:pStyle w:val="Heading2"/>
+      </w:pPr>
+      <w:r>
+        <w:t>ADR-020 — Tests de dominio desde Fase 1</w:t>
+      </w:r>
+    </w:p>
+    <w:p>
+      <w:r>
+        <w:t>42 casos en GymTracker.Tests cubren Routine, WorkoutSession, TrainingCycle, Workout y UserSettings. Motivo: red de seguridad inmediata; ya detectaron el bug de reordenamiento antes de llegar a la base de datos.</w:t>
       </w:r>
     </w:p>
     <w:sectPr>

</xml_diff>

<commit_message>
added dbContext implemented OnModelCreating
</commit_message>
<xml_diff>
--- a/Migration/GymTraker V2/GymTracker/docs/GymTracker-V2-Documentacion.docx
+++ b/Migration/GymTraker V2/GymTracker/docs/GymTracker-V2-Documentacion.docx
@@ -20,7 +20,7 @@
         <w:rPr>
           <w:i/>
         </w:rPr>
-        <w:t>Versión 2.0 | Última actualización: 2026-08-03 | Estado: Fase 1 (Domain) completada — Fase 2 (Identity + EF Core + PostgreSQL) en preparación | Proyecto: rediseño de GymTracker con ASP.NET Core + Clean Architecture + DDD (caso de estudio del curso).</w:t>
+        <w:t>Versión 2.0 | Última actualización: 2026-08-18 | Estado: Fase 1 (Domain) completada — Fase 2 (Identity + EF Core + PostgreSQL) en preparación | Plan de empleabilidad integrado (sección 10) | Proyecto: rediseño de GymTracker con ASP.NET Core + Clean Architecture + DDD (caso de estudio del curso).</w:t>
       </w:r>
     </w:p>
     <w:p>
@@ -173,6 +173,14 @@
       </w:pPr>
       <w:r>
         <w:t>Sección 9: progreso detallado y plan exacto de la próxima sesión.</w:t>
+      </w:r>
+    </w:p>
+    <w:p>
+      <w:pPr>
+        <w:pStyle w:val="ListBullet"/>
+      </w:pPr>
+      <w:r>
+        <w:t>Sección 10: plan de empleabilidad (integración con el mercado y los archivos de trabajo).</w:t>
       </w:r>
     </w:p>
     <w:p>
@@ -6477,6 +6485,665 @@
     <w:p>
       <w:r>
         <w:t>9. Verificación de la Fase 2: tablas creadas (AspNetUsers + las 12 de dominio), seed presente, API levanta y Swagger carga.</w:t>
+      </w:r>
+    </w:p>
+    <w:p>
+      <w:pPr>
+        <w:pStyle w:val="Heading1"/>
+      </w:pPr>
+      <w:r>
+        <w:t>10. Plan de empleabilidad (integración con el mercado)</w:t>
+      </w:r>
+    </w:p>
+    <w:p>
+      <w:pPr/>
+      <w:r>
+        <w:t>El mercado colombiano C#/.NET (17 ofertas analizadas el 2026-08-18) pide C#, .NET y SQL en ~82% de los casos; cloud (Azure/AWS) en 71%; testing en 65%; ASP.NET, JavaScript y CI/CD en ~59%; React en 41%. Esta sección integra la estrategia de empleabilidad con el roadmap técnico (secciones 8-9): cada fase de GymTracker agrega keywords verificables al CV. El orden técnico de la sección 9.2 no cambia; lo que cambia es la prioridad según mercado: SQL, testing y cloud antes que features avanzadas.</w:t>
+      </w:r>
+    </w:p>
+    <w:p>
+      <w:pPr>
+        <w:pStyle w:val="Heading2"/>
+      </w:pPr>
+      <w:r>
+        <w:t>10.1 Mapa: habilidad del mercado → fase de GymTracker → semana → CV</w:t>
+      </w:r>
+    </w:p>
+    <w:tbl>
+      <w:tblPr>
+        <w:tblStyle w:val="TableGrid"/>
+        <w:tblW w:type="auto" w:w="0"/>
+        <w:tblLook w:firstColumn="1" w:firstRow="1" w:lastColumn="0" w:lastRow="0" w:noHBand="0" w:noVBand="1" w:val="04A0"/>
+      </w:tblPr>
+      <w:tblGrid>
+        <w:gridCol w:w="720"/>
+        <w:gridCol w:w="1400"/>
+        <w:gridCol w:w="1500"/>
+        <w:gridCol w:w="2800"/>
+        <w:gridCol w:w="2220"/>
+      </w:tblGrid>
+      <w:tr>
+        <w:tc>
+          <w:tcPr>
+            <w:tcW w:type="dxa" w:w="720"/>
+          </w:tcPr>
+          <w:p>
+            <w:r/>
+            <w:r>
+              <w:rPr>
+                <w:b/>
+              </w:rPr>
+              <w:t>Semana</w:t>
+            </w:r>
+          </w:p>
+        </w:tc>
+        <w:tc>
+          <w:tcPr>
+            <w:tcW w:type="dxa" w:w="1400"/>
+          </w:tcPr>
+          <w:p>
+            <w:r/>
+            <w:r>
+              <w:rPr>
+                <w:b/>
+              </w:rPr>
+              <w:t>Fase GymTracker</w:t>
+            </w:r>
+          </w:p>
+        </w:tc>
+        <w:tc>
+          <w:tcPr>
+            <w:tcW w:type="dxa" w:w="1500"/>
+          </w:tcPr>
+          <w:p>
+            <w:r/>
+            <w:r>
+              <w:rPr>
+                <w:b/>
+              </w:rPr>
+              <w:t>Habilidad del mercado</w:t>
+            </w:r>
+          </w:p>
+        </w:tc>
+        <w:tc>
+          <w:tcPr>
+            <w:tcW w:type="dxa" w:w="2800"/>
+          </w:tcPr>
+          <w:p>
+            <w:r/>
+            <w:r>
+              <w:rPr>
+                <w:b/>
+              </w:rPr>
+              <w:t>Keywords CV</w:t>
+            </w:r>
+          </w:p>
+        </w:tc>
+        <w:tc>
+          <w:tcPr>
+            <w:tcW w:type="dxa" w:w="2220"/>
+          </w:tcPr>
+          <w:p>
+            <w:r/>
+            <w:r>
+              <w:rPr>
+                <w:b/>
+              </w:rPr>
+              <w:t>Entregable</w:t>
+            </w:r>
+          </w:p>
+        </w:tc>
+      </w:tr>
+      <w:tr>
+        <w:tc>
+          <w:tcPr>
+            <w:tcW w:type="dxa" w:w="720"/>
+          </w:tcPr>
+          <w:p>
+            <w:r/>
+            <w:r>
+              <w:t>1-2</w:t>
+            </w:r>
+          </w:p>
+        </w:tc>
+        <w:tc>
+          <w:tcPr>
+            <w:tcW w:type="dxa" w:w="1400"/>
+          </w:tcPr>
+          <w:p>
+            <w:r/>
+            <w:r>
+              <w:t>Fase 2</w:t>
+            </w:r>
+          </w:p>
+        </w:tc>
+        <w:tc>
+          <w:tcPr>
+            <w:tcW w:type="dxa" w:w="1500"/>
+          </w:tcPr>
+          <w:p>
+            <w:r/>
+            <w:r>
+              <w:t>EF Core, PostgreSQL, Identity</w:t>
+            </w:r>
+          </w:p>
+        </w:tc>
+        <w:tc>
+          <w:tcPr>
+            <w:tcW w:type="dxa" w:w="2800"/>
+          </w:tcPr>
+          <w:p>
+            <w:r/>
+            <w:r>
+              <w:t>Entity Framework Core, PostgreSQL, ASP.NET Identity, Migrations</w:t>
+            </w:r>
+          </w:p>
+        </w:tc>
+        <w:tc>
+          <w:tcPr>
+            <w:tcW w:type="dxa" w:w="2220"/>
+          </w:tcPr>
+          <w:p>
+            <w:r/>
+            <w:r>
+              <w:t>DbContext + tablas + seed + Swagger</w:t>
+            </w:r>
+          </w:p>
+        </w:tc>
+      </w:tr>
+      <w:tr>
+        <w:tc>
+          <w:tcPr>
+            <w:tcW w:type="dxa" w:w="720"/>
+          </w:tcPr>
+          <w:p>
+            <w:r/>
+            <w:r>
+              <w:t>3</w:t>
+            </w:r>
+          </w:p>
+        </w:tc>
+        <w:tc>
+          <w:tcPr>
+            <w:tcW w:type="dxa" w:w="1400"/>
+          </w:tcPr>
+          <w:p>
+            <w:r/>
+            <w:r>
+              <w:t>Fase 3 — Routine</w:t>
+            </w:r>
+          </w:p>
+        </w:tc>
+        <w:tc>
+          <w:tcPr>
+            <w:tcW w:type="dxa" w:w="1500"/>
+          </w:tcPr>
+          <w:p>
+            <w:r/>
+            <w:r>
+              <w:t>REST API, DI, Testing</w:t>
+            </w:r>
+          </w:p>
+        </w:tc>
+        <w:tc>
+          <w:tcPr>
+            <w:tcW w:type="dxa" w:w="2800"/>
+          </w:tcPr>
+          <w:p>
+            <w:r/>
+            <w:r>
+              <w:t>REST API, DTOs, Dependency Injection, xUnit</w:t>
+            </w:r>
+          </w:p>
+        </w:tc>
+        <w:tc>
+          <w:tcPr>
+            <w:tcW w:type="dxa" w:w="2220"/>
+          </w:tcPr>
+          <w:p>
+            <w:r/>
+            <w:r>
+              <w:t>CRUD rutinas con tests</w:t>
+            </w:r>
+          </w:p>
+        </w:tc>
+      </w:tr>
+      <w:tr>
+        <w:tc>
+          <w:tcPr>
+            <w:tcW w:type="dxa" w:w="720"/>
+          </w:tcPr>
+          <w:p>
+            <w:r/>
+            <w:r>
+              <w:t>4</w:t>
+            </w:r>
+          </w:p>
+        </w:tc>
+        <w:tc>
+          <w:tcPr>
+            <w:tcW w:type="dxa" w:w="1400"/>
+          </w:tcPr>
+          <w:p>
+            <w:r/>
+            <w:r>
+              <w:t>Fase 4 — Workout</w:t>
+            </w:r>
+          </w:p>
+        </w:tc>
+        <w:tc>
+          <w:tcPr>
+            <w:tcW w:type="dxa" w:w="1500"/>
+          </w:tcPr>
+          <w:p>
+            <w:r/>
+            <w:r>
+              <w:t>SQL, consultas</w:t>
+            </w:r>
+          </w:p>
+        </w:tc>
+        <w:tc>
+          <w:tcPr>
+            <w:tcW w:type="dxa" w:w="2800"/>
+          </w:tcPr>
+          <w:p>
+            <w:r/>
+            <w:r>
+              <w:t>SQL, LINQ, Transactions, Indexes</w:t>
+            </w:r>
+          </w:p>
+        </w:tc>
+        <w:tc>
+          <w:tcPr>
+            <w:tcW w:type="dxa" w:w="2220"/>
+          </w:tcPr>
+          <w:p>
+            <w:r/>
+            <w:r>
+              <w:t>Historial + PR</w:t>
+            </w:r>
+          </w:p>
+        </w:tc>
+      </w:tr>
+      <w:tr>
+        <w:tc>
+          <w:tcPr>
+            <w:tcW w:type="dxa" w:w="720"/>
+          </w:tcPr>
+          <w:p>
+            <w:r/>
+            <w:r>
+              <w:t>5</w:t>
+            </w:r>
+          </w:p>
+        </w:tc>
+        <w:tc>
+          <w:tcPr>
+            <w:tcW w:type="dxa" w:w="1400"/>
+          </w:tcPr>
+          <w:p>
+            <w:r/>
+            <w:r>
+              <w:t>Fase 5 — Cycle + Docker</w:t>
+            </w:r>
+          </w:p>
+        </w:tc>
+        <w:tc>
+          <w:tcPr>
+            <w:tcW w:type="dxa" w:w="1500"/>
+          </w:tcPr>
+          <w:p>
+            <w:r/>
+            <w:r>
+              <w:t>Docker</w:t>
+            </w:r>
+          </w:p>
+        </w:tc>
+        <w:tc>
+          <w:tcPr>
+            <w:tcW w:type="dxa" w:w="2800"/>
+          </w:tcPr>
+          <w:p>
+            <w:r/>
+            <w:r>
+              <w:t>Docker, Docker Compose</w:t>
+            </w:r>
+          </w:p>
+        </w:tc>
+        <w:tc>
+          <w:tcPr>
+            <w:tcW w:type="dxa" w:w="2220"/>
+          </w:tcPr>
+          <w:p>
+            <w:r/>
+            <w:r>
+              <w:t>compose API + PostgreSQL</w:t>
+            </w:r>
+          </w:p>
+        </w:tc>
+      </w:tr>
+      <w:tr>
+        <w:tc>
+          <w:tcPr>
+            <w:tcW w:type="dxa" w:w="720"/>
+          </w:tcPr>
+          <w:p>
+            <w:r/>
+            <w:r>
+              <w:t>6</w:t>
+            </w:r>
+          </w:p>
+        </w:tc>
+        <w:tc>
+          <w:tcPr>
+            <w:tcW w:type="dxa" w:w="1400"/>
+          </w:tcPr>
+          <w:p>
+            <w:r/>
+            <w:r>
+              <w:t>Fase 6 — CI/CD + Azure</w:t>
+            </w:r>
+          </w:p>
+        </w:tc>
+        <w:tc>
+          <w:tcPr>
+            <w:tcW w:type="dxa" w:w="1500"/>
+          </w:tcPr>
+          <w:p>
+            <w:r/>
+            <w:r>
+              <w:t>GitHub Actions, Azure</w:t>
+            </w:r>
+          </w:p>
+        </w:tc>
+        <w:tc>
+          <w:tcPr>
+            <w:tcW w:type="dxa" w:w="2800"/>
+          </w:tcPr>
+          <w:p>
+            <w:r/>
+            <w:r>
+              <w:t>CI/CD, GitHub Actions, Azure App Service, Azure SQL</w:t>
+            </w:r>
+          </w:p>
+        </w:tc>
+        <w:tc>
+          <w:tcPr>
+            <w:tcW w:type="dxa" w:w="2220"/>
+          </w:tcPr>
+          <w:p>
+            <w:r/>
+            <w:r>
+              <w:t>Pipeline verde + deploy</w:t>
+            </w:r>
+          </w:p>
+        </w:tc>
+      </w:tr>
+      <w:tr>
+        <w:tc>
+          <w:tcPr>
+            <w:tcW w:type="dxa" w:w="720"/>
+          </w:tcPr>
+          <w:p>
+            <w:r/>
+            <w:r>
+              <w:t>7</w:t>
+            </w:r>
+          </w:p>
+        </w:tc>
+        <w:tc>
+          <w:tcPr>
+            <w:tcW w:type="dxa" w:w="1400"/>
+          </w:tcPr>
+          <w:p>
+            <w:r/>
+            <w:r>
+              <w:t>Fase 7 — Hardening</w:t>
+            </w:r>
+          </w:p>
+        </w:tc>
+        <w:tc>
+          <w:tcPr>
+            <w:tcW w:type="dxa" w:w="1500"/>
+          </w:tcPr>
+          <w:p>
+            <w:r/>
+            <w:r>
+              <w:t>Azure, observabilidad</w:t>
+            </w:r>
+          </w:p>
+        </w:tc>
+        <w:tc>
+          <w:tcPr>
+            <w:tcW w:type="dxa" w:w="2800"/>
+          </w:tcPr>
+          <w:p>
+            <w:r/>
+            <w:r>
+              <w:t>Azure Key Vault, Application Insights</w:t>
+            </w:r>
+          </w:p>
+        </w:tc>
+        <w:tc>
+          <w:tcPr>
+            <w:tcW w:type="dxa" w:w="2220"/>
+          </w:tcPr>
+          <w:p>
+            <w:r/>
+            <w:r>
+              <w:t>Caso de estudio</w:t>
+            </w:r>
+          </w:p>
+        </w:tc>
+      </w:tr>
+      <w:tr>
+        <w:tc>
+          <w:tcPr>
+            <w:tcW w:type="dxa" w:w="720"/>
+          </w:tcPr>
+          <w:p>
+            <w:r/>
+            <w:r>
+              <w:t>8-9</w:t>
+            </w:r>
+          </w:p>
+        </w:tc>
+        <w:tc>
+          <w:tcPr>
+            <w:tcW w:type="dxa" w:w="1400"/>
+          </w:tcPr>
+          <w:p>
+            <w:r/>
+            <w:r>
+              <w:t>Fase 8 — Frontend</w:t>
+            </w:r>
+          </w:p>
+        </w:tc>
+        <w:tc>
+          <w:tcPr>
+            <w:tcW w:type="dxa" w:w="1500"/>
+          </w:tcPr>
+          <w:p>
+            <w:r/>
+            <w:r>
+              <w:t>React, TypeScript, JWT</w:t>
+            </w:r>
+          </w:p>
+        </w:tc>
+        <w:tc>
+          <w:tcPr>
+            <w:tcW w:type="dxa" w:w="2800"/>
+          </w:tcPr>
+          <w:p>
+            <w:r/>
+            <w:r>
+              <w:t>React, TypeScript, JWT</w:t>
+            </w:r>
+          </w:p>
+        </w:tc>
+        <w:tc>
+          <w:tcPr>
+            <w:tcW w:type="dxa" w:w="2220"/>
+          </w:tcPr>
+          <w:p>
+            <w:r/>
+            <w:r>
+              <w:t>Frontend conectado</w:t>
+            </w:r>
+          </w:p>
+        </w:tc>
+      </w:tr>
+      <w:tr>
+        <w:tc>
+          <w:tcPr>
+            <w:tcW w:type="dxa" w:w="720"/>
+          </w:tcPr>
+          <w:p>
+            <w:r/>
+            <w:r>
+              <w:t>10-11</w:t>
+            </w:r>
+          </w:p>
+        </w:tc>
+        <w:tc>
+          <w:tcPr>
+            <w:tcW w:type="dxa" w:w="1400"/>
+          </w:tcPr>
+          <w:p>
+            <w:r/>
+            <w:r>
+              <w:t>Entrevistas</w:t>
+            </w:r>
+          </w:p>
+        </w:tc>
+        <w:tc>
+          <w:tcPr>
+            <w:tcW w:type="dxa" w:w="1500"/>
+          </w:tcPr>
+          <w:p>
+            <w:r/>
+            <w:r>
+              <w:t>SQL Server, algoritmos, inglés</w:t>
+            </w:r>
+          </w:p>
+        </w:tc>
+        <w:tc>
+          <w:tcPr>
+            <w:tcW w:type="dxa" w:w="2800"/>
+          </w:tcPr>
+          <w:p>
+            <w:r/>
+            <w:r>
+              <w:t>SQL Server, Stored Procedures</w:t>
+            </w:r>
+          </w:p>
+        </w:tc>
+        <w:tc>
+          <w:tcPr>
+            <w:tcW w:type="dxa" w:w="2220"/>
+          </w:tcPr>
+          <w:p>
+            <w:r/>
+            <w:r>
+              <w:t>Listo para entrevistas</w:t>
+            </w:r>
+          </w:p>
+        </w:tc>
+      </w:tr>
+      <w:tr>
+        <w:tc>
+          <w:tcPr>
+            <w:tcW w:type="dxa" w:w="720"/>
+          </w:tcPr>
+          <w:p>
+            <w:r/>
+            <w:r>
+              <w:t>12</w:t>
+            </w:r>
+          </w:p>
+        </w:tc>
+        <w:tc>
+          <w:tcPr>
+            <w:tcW w:type="dxa" w:w="1400"/>
+          </w:tcPr>
+          <w:p>
+            <w:r/>
+            <w:r>
+              <w:t>Negociación</w:t>
+            </w:r>
+          </w:p>
+        </w:tc>
+        <w:tc>
+          <w:tcPr>
+            <w:tcW w:type="dxa" w:w="1500"/>
+          </w:tcPr>
+          <w:p>
+            <w:r/>
+            <w:r>
+              <w:t>—</w:t>
+            </w:r>
+          </w:p>
+        </w:tc>
+        <w:tc>
+          <w:tcPr>
+            <w:tcW w:type="dxa" w:w="2800"/>
+          </w:tcPr>
+          <w:p>
+            <w:r/>
+            <w:r>
+              <w:t>—</w:t>
+            </w:r>
+          </w:p>
+        </w:tc>
+        <w:tc>
+          <w:tcPr>
+            <w:tcW w:type="dxa" w:w="2220"/>
+          </w:tcPr>
+          <w:p>
+            <w:r/>
+            <w:r>
+              <w:t>Oferta firmada</w:t>
+            </w:r>
+          </w:p>
+        </w:tc>
+      </w:tr>
+    </w:tbl>
+    <w:p>
+      <w:pPr>
+        <w:pStyle w:val="Heading2"/>
+      </w:pPr>
+      <w:r>
+        <w:t>10.2 Archivos de trabajo</w:t>
+      </w:r>
+    </w:p>
+    <w:p>
+      <w:pPr>
+        <w:pStyle w:val="ListBullet"/>
+      </w:pPr>
+      <w:r>
+        <w:t>ROADMAP-EMPLEABILIDAD.md — análisis del mercado (17 ofertas), gaps del CV, ofertas objetivo y temario de entrevistas.</w:t>
+      </w:r>
+    </w:p>
+    <w:p>
+      <w:pPr>
+        <w:pStyle w:val="ListBullet"/>
+      </w:pPr>
+      <w:r>
+        <w:t>PLAN-INTEGRADO-EMPLEABILIDAD.md — plan maestro operativo: mapa habilidades → fases → semanas y plan semanal combinado (técnico + búsqueda).</w:t>
+      </w:r>
+    </w:p>
+    <w:p>
+      <w:pPr>
+        <w:pStyle w:val="ListBullet"/>
+      </w:pPr>
+      <w:r>
+        <w:t>Este documento — referencia técnica: arquitectura, ADRs 001-027, diseño de BD y fases 1-7.</w:t>
+      </w:r>
+    </w:p>
+    <w:p>
+      <w:pPr/>
+      <w:r>
+        <w:t>Nota (2026-08-18): esta sección se añadió para integrar los archivos de empleabilidad; el resto del documento no cambia. El orden técnico de trabajo sigue siendo el de la sección 9.2.</w:t>
       </w:r>
     </w:p>
     <w:sectPr>

</xml_diff>

<commit_message>
use hasData for exercisesCatalog New Migration
</commit_message>
<xml_diff>
--- a/Migration/GymTraker V2/GymTracker/docs/GymTracker-V2-Documentacion.docx
+++ b/Migration/GymTraker V2/GymTracker/docs/GymTracker-V2-Documentacion.docx
@@ -20,7 +20,7 @@
         <w:rPr>
           <w:i/>
         </w:rPr>
-        <w:t>Versión 2.0 | Última actualización: 2026-08-18 | Estado: Fase 1 (Domain) completada — Fase 2 (Identity + EF Core + PostgreSQL) en preparación | Plan de empleabilidad integrado (sección 10) | Proyecto: rediseño de GymTracker con ASP.NET Core + Clean Architecture + DDD (caso de estudio del curso).</w:t>
+        <w:t>Versión 2.0 | Última actualización: 2026-08-20 | Estado: Fase 1 (Domain) completada — Fase 2 (Identity + EF Core + PostgreSQL) completada — Fase 3 (Feature Routine) en preparación | Plan de empleabilidad integrado (sección 10) | Proyecto: rediseño de GymTracker con ASP.NET Core + Clean Architecture + DDD (caso de estudio del curso).</w:t>
       </w:r>
     </w:p>
     <w:p>
@@ -60,7 +60,7 @@
         <w:pStyle w:val="ListBullet"/>
       </w:pPr>
       <w:r>
-        <w:t>Siguiente paso: Fase 2 (Identity + EF Core + PostgreSQL). El orden de trabajo exacto está en la sección 9.2.</w:t>
+        <w:t>Fase 2 (Identity + EF Core + PostgreSQL) COMPLETADA (2026-08-20): migración InitialCreate aplicada y seed del catálogo con HasData (111 ejercicios). Siguiente paso: Fase 3 (Feature Routine).</w:t>
       </w:r>
     </w:p>
     <w:p>
@@ -6116,6 +6116,52 @@
           <w:p>
             <w:r>
               <w:t>Aceptado</w:t>
+            </w:r>
+          </w:p>
+        </w:tc>
+      </w:tr>
+      <w:tr>
+        <w:tc>
+          <w:tcPr>
+            <w:tcW w:type="dxa" w:w="2160"/>
+          </w:tcPr>
+          <w:p>
+            <w:r/>
+            <w:r>
+              <w:t>ADR-028</w:t>
+            </w:r>
+          </w:p>
+        </w:tc>
+        <w:tc>
+          <w:tcPr>
+            <w:tcW w:type="dxa" w:w="2160"/>
+          </w:tcPr>
+          <w:p>
+            <w:r/>
+            <w:r>
+              <w:t>ExerciseCatalogEntry con Id int (identity de BD); el catálogo deja de heredar la base Entity</w:t>
+            </w:r>
+          </w:p>
+        </w:tc>
+        <w:tc>
+          <w:tcPr>
+            <w:tcW w:type="dxa" w:w="2160"/>
+          </w:tcPr>
+          <w:p>
+            <w:r/>
+            <w:r>
+              <w:t>El catálogo es dato de referencia global, no un agregado del dominio: int permite IDs de seed deterministas (1..111) para HasData y una identidad secuencial natural en BD; los agregados (Routine, Workout, TrainingCycle, etc.) siguen con Guid</w:t>
+            </w:r>
+          </w:p>
+        </w:tc>
+        <w:tc>
+          <w:tcPr>
+            <w:tcW w:type="dxa" w:w="2160"/>
+          </w:tcPr>
+          <w:p>
+            <w:r/>
+            <w:r>
+              <w:t>Implementado (2026-08-20)</w:t>
             </w:r>
           </w:p>
         </w:tc>

</xml_diff>

<commit_message>
starting implementation for AddIdentityCore
</commit_message>
<xml_diff>
--- a/Migration/GymTraker V2/GymTracker/docs/GymTracker-V2-Documentacion.docx
+++ b/Migration/GymTraker V2/GymTracker/docs/GymTracker-V2-Documentacion.docx
@@ -20,7 +20,7 @@
         <w:rPr>
           <w:i/>
         </w:rPr>
-        <w:t>Versión 2.0 | Última actualización: 2026-08-20 | Estado: Fase 1 (Domain) completada — Fase 2 (Identity + EF Core + PostgreSQL) completada — Fase 3 (Feature Routine) en preparación | Plan de empleabilidad integrado (sección 10) | Proyecto: rediseño de GymTracker con ASP.NET Core + Clean Architecture + DDD (caso de estudio del curso).</w:t>
+        <w:t>Versión 2.0 | Última actualización: 2026-08-25 | Estado: Fase 1 (Domain) completada — Fase 2 (Identity + EF Core + PostgreSQL) completada — Fase 3 en curso — slice Auth (AddIdentityCore + JWT) en implementación | Plan de empleabilidad integrado (sección 10) | Proyecto: rediseño de GymTracker con ASP.NET Core + Clean Architecture + DDD (caso de estudio del curso).</w:t>
       </w:r>
     </w:p>
     <w:p>
@@ -60,7 +60,7 @@
         <w:pStyle w:val="ListBullet"/>
       </w:pPr>
       <w:r>
-        <w:t>Fase 2 (Identity + EF Core + PostgreSQL) COMPLETADA (2026-08-20): migración InitialCreate aplicada y seed del catálogo con HasData (111 ejercicios). Siguiente paso: Fase 3 (Feature Routine).</w:t>
+        <w:t>Fase 2 (Identity + EF Core + PostgreSQL) COMPLETADA (2026-08-20): migración InitialCreate aplicada y seed del catálogo con HasData (111 ejercicios). Siguiente paso: Fase 3 — slice Auth (AddIdentityCore + JWT) y luego Feature Routine.</w:t>
       </w:r>
     </w:p>
     <w:p>
@@ -92,7 +92,7 @@
         <w:pStyle w:val="ListBullet"/>
       </w:pPr>
       <w:r>
-        <w:t>Autenticación = Identity + Google + JWT, Opción A (ADR-022).</w:t>
+        <w:t>Autenticación = Identity + Google + JWT con AddIdentityCore API-first (ADR-022, ADR-029).</w:t>
       </w:r>
     </w:p>
     <w:p>
@@ -5904,8 +5904,9 @@
             <w:tcW w:type="dxa" w:w="2160"/>
           </w:tcPr>
           <w:p>
-            <w:r>
-              <w:t>Aceptado</w:t>
+            <w:r/>
+            <w:r>
+              <w:t>En curso (Fase 3): JWT + register/login implementados; Google pendiente</w:t>
             </w:r>
           </w:p>
         </w:tc>
@@ -6162,6 +6163,52 @@
             <w:r/>
             <w:r>
               <w:t>Implementado (2026-08-20)</w:t>
+            </w:r>
+          </w:p>
+        </w:tc>
+      </w:tr>
+      <w:tr>
+        <w:tc>
+          <w:tcPr>
+            <w:tcW w:type="dxa" w:w="2160"/>
+          </w:tcPr>
+          <w:p>
+            <w:r/>
+            <w:r>
+              <w:t>ADR-029</w:t>
+            </w:r>
+          </w:p>
+        </w:tc>
+        <w:tc>
+          <w:tcPr>
+            <w:tcW w:type="dxa" w:w="2160"/>
+          </w:tcPr>
+          <w:p>
+            <w:r/>
+            <w:r>
+              <w:t>Autenticación API-first con AddIdentityCore (sin cookies) + JWT bearer</w:t>
+            </w:r>
+          </w:p>
+        </w:tc>
+        <w:tc>
+          <w:tcPr>
+            <w:tcW w:type="dxa" w:w="2160"/>
+          </w:tcPr>
+          <w:p>
+            <w:r/>
+            <w:r>
+              <w:t>AddIdentity registra cookies y servicios pensados para MVC; AddIdentityCore registra solo lo esencial (UserManager, stores) y deja el esquema de autenticación al JWT bearer, permitiendo que la API sirva a múltiples frontends (PWA, React, móvil)</w:t>
+            </w:r>
+          </w:p>
+        </w:tc>
+        <w:tc>
+          <w:tcPr>
+            <w:tcW w:type="dxa" w:w="2160"/>
+          </w:tcPr>
+          <w:p>
+            <w:r/>
+            <w:r>
+              <w:t>Aceptado (Fase 3) — en implementación</w:t>
             </w:r>
           </w:p>
         </w:tc>

</xml_diff>

<commit_message>
added Dtos for routine, sesion and exercise update RoutineController and endpoints to hanlde CRUD in entities
</commit_message>
<xml_diff>
--- a/Migration/GymTraker V2/GymTracker/docs/GymTracker-V2-Documentacion.docx
+++ b/Migration/GymTraker V2/GymTracker/docs/GymTracker-V2-Documentacion.docx
@@ -20,7 +20,7 @@
         <w:rPr>
           <w:i/>
         </w:rPr>
-        <w:t>Versión 2.0 | Última actualización: 2026-08-25 | Estado: Fase 1 (Domain) completada — Fase 2 (Identity + EF Core + PostgreSQL) completada — Fase 3 en curso — slice Auth (AddIdentityCore + JWT) en implementación | Plan de empleabilidad integrado (sección 10) | Proyecto: rediseño de GymTracker con ASP.NET Core + Clean Architecture + DDD (caso de estudio del curso).</w:t>
+        <w:t>Versión 2.0 | Última actualización: 2026-09-03 | Estado: Fase 1 (Domain) completada — Fase 2 (Identity + EF Core + PostgreSQL) completada — Fase 3 (Auth API + Feature Routine) completada — Fase 4 (Feature Workout) en preparación | Plan de empleabilidad integrado (sección 10) | Proyecto: rediseño de GymTracker con ASP.NET Core + Clean Architecture + DDD (caso de estudio del curso).</w:t>
       </w:r>
     </w:p>
     <w:p>
@@ -60,7 +60,7 @@
         <w:pStyle w:val="ListBullet"/>
       </w:pPr>
       <w:r>
-        <w:t>Fase 2 (Identity + EF Core + PostgreSQL) COMPLETADA (2026-08-20): migración InitialCreate aplicada y seed del catálogo con HasData (111 ejercicios). Siguiente paso: Fase 3 — slice Auth (AddIdentityCore + JWT) y luego Feature Routine.</w:t>
+        <w:t>Fase 3 (2026-09-03) COMPLETADA: slice Auth (AddIdentityCore + JWT + middleware de errores) y Feature Routine completa (CRUD rutina + sesiones + ejercicios, comandos del editor). Siguiente paso: Fase 4 — Feature Workout (registro de entrenamiento, historial, PR).</w:t>
       </w:r>
     </w:p>
     <w:p>
@@ -6209,6 +6209,52 @@
             <w:r/>
             <w:r>
               <w:t>Aceptado (Fase 3) — en implementación</w:t>
+            </w:r>
+          </w:p>
+        </w:tc>
+      </w:tr>
+      <w:tr>
+        <w:tc>
+          <w:tcPr>
+            <w:tcW w:type="dxa" w:w="2160"/>
+          </w:tcPr>
+          <w:p>
+            <w:r/>
+            <w:r>
+              <w:t>ADR-030</w:t>
+            </w:r>
+          </w:p>
+        </w:tc>
+        <w:tc>
+          <w:tcPr>
+            <w:tcW w:type="dxa" w:w="2160"/>
+          </w:tcPr>
+          <w:p>
+            <w:r/>
+            <w:r>
+              <w:t>API de edición de rutinas por comandos granulares sobre el agregado Routine</w:t>
+            </w:r>
+          </w:p>
+        </w:tc>
+        <w:tc>
+          <w:tcPr>
+            <w:tcW w:type="dxa" w:w="2160"/>
+          </w:tcPr>
+          <w:p>
+            <w:r/>
+            <w:r>
+              <w:t>El editor (index.html) modifica rutina, sesiones y ejercicios; cada acción del editor mapea 1:1 con un comportamiento del dominio (Rename, AddSession, RemoveSession, AddExercise, EditExercise, etc.) y persiste cargando el agregado con tracking. Se descarta el PUT del documento completo (estilo Firestore): evita diffs complejos, da errores precisos (404 por recurso) y prepara sincronización por acciones</w:t>
+            </w:r>
+          </w:p>
+        </w:tc>
+        <w:tc>
+          <w:tcPr>
+            <w:tcW w:type="dxa" w:w="2160"/>
+          </w:tcPr>
+          <w:p>
+            <w:r/>
+            <w:r>
+              <w:t>Implementado (2026-09-03)</w:t>
             </w:r>
           </w:p>
         </w:tc>

</xml_diff>